<commit_message>
Clean ChromaDB data, fix evaluation test case
</commit_message>
<xml_diff>
--- a/data/hr/salary-policy.docx
+++ b/data/hr/salary-policy.docx
@@ -4,13 +4,7 @@
   <w:body>
     <w:p>
       <w:r>
-        <w:t>Salary Policy</w:t>
-      </w:r>
-    </w:p>
-    <w:p/>
-    <w:p>
-      <w:r>
-        <w:t>Employees receive salary on the 25th of each month.</w:t>
+        <w:t>Salary Policy Employees receive salary on the 25th of each month.</w:t>
       </w:r>
     </w:p>
     <w:sectPr>

</xml_diff>